<commit_message>
front-end late and undertime calculation
</commit_message>
<xml_diff>
--- a/storage/app/templates/Sample.docx
+++ b/storage/app/templates/Sample.docx
@@ -854,26 +854,11 @@
                                 <w:p>
                                   <w:pPr>
                                     <w:pStyle w:val="TableParagraph"/>
-                                    <w:jc w:val="center"/>
                                     <w:rPr>
                                       <w:rFonts w:ascii="Times New Roman"/>
                                       <w:sz w:val="18"/>
                                     </w:rPr>
                                   </w:pPr>
-                                  <w:r>
-                                    <w:rPr>
-                                      <w:b/>
-                                      <w:sz w:val="16"/>
-                                    </w:rPr>
-                                    <w:t>${</w:t>
-                                  </w:r>
-                                  <w:r>
-                                    <w:rPr>
-                                      <w:b/>
-                                      <w:sz w:val="16"/>
-                                    </w:rPr>
-                                    <w:t>late1}</w:t>
-                                  </w:r>
                                 </w:p>
                               </w:tc>
                               <w:tc>
@@ -883,33 +868,11 @@
                                 <w:p>
                                   <w:pPr>
                                     <w:pStyle w:val="TableParagraph"/>
-                                    <w:jc w:val="center"/>
                                     <w:rPr>
                                       <w:rFonts w:ascii="Times New Roman"/>
                                       <w:sz w:val="18"/>
                                     </w:rPr>
                                   </w:pPr>
-                                  <w:r>
-                                    <w:rPr>
-                                      <w:b/>
-                                      <w:sz w:val="16"/>
-                                    </w:rPr>
-                                    <w:t>${</w:t>
-                                  </w:r>
-                                  <w:r>
-                                    <w:rPr>
-                                      <w:b/>
-                                      <w:sz w:val="16"/>
-                                    </w:rPr>
-                                    <w:t>ut</w:t>
-                                  </w:r>
-                                  <w:r>
-                                    <w:rPr>
-                                      <w:b/>
-                                      <w:sz w:val="16"/>
-                                    </w:rPr>
-                                    <w:t>1}</w:t>
-                                  </w:r>
                                 </w:p>
                               </w:tc>
                             </w:tr>
@@ -1348,26 +1311,11 @@
                           <w:p>
                             <w:pPr>
                               <w:pStyle w:val="TableParagraph"/>
-                              <w:jc w:val="center"/>
                               <w:rPr>
                                 <w:rFonts w:ascii="Times New Roman"/>
                                 <w:sz w:val="18"/>
                               </w:rPr>
                             </w:pPr>
-                            <w:r>
-                              <w:rPr>
-                                <w:b/>
-                                <w:sz w:val="16"/>
-                              </w:rPr>
-                              <w:t>${</w:t>
-                            </w:r>
-                            <w:r>
-                              <w:rPr>
-                                <w:b/>
-                                <w:sz w:val="16"/>
-                              </w:rPr>
-                              <w:t>late1}</w:t>
-                            </w:r>
                           </w:p>
                         </w:tc>
                         <w:tc>
@@ -1377,33 +1325,11 @@
                           <w:p>
                             <w:pPr>
                               <w:pStyle w:val="TableParagraph"/>
-                              <w:jc w:val="center"/>
                               <w:rPr>
                                 <w:rFonts w:ascii="Times New Roman"/>
                                 <w:sz w:val="18"/>
                               </w:rPr>
                             </w:pPr>
-                            <w:r>
-                              <w:rPr>
-                                <w:b/>
-                                <w:sz w:val="16"/>
-                              </w:rPr>
-                              <w:t>${</w:t>
-                            </w:r>
-                            <w:r>
-                              <w:rPr>
-                                <w:b/>
-                                <w:sz w:val="16"/>
-                              </w:rPr>
-                              <w:t>ut</w:t>
-                            </w:r>
-                            <w:r>
-                              <w:rPr>
-                                <w:b/>
-                                <w:sz w:val="16"/>
-                              </w:rPr>
-                              <w:t>1}</w:t>
-                            </w:r>
                           </w:p>
                         </w:tc>
                       </w:tr>
@@ -1938,42 +1864,13 @@
                                 <w:p>
                                   <w:pPr>
                                     <w:pStyle w:val="TableParagraph"/>
-                                    <w:jc w:val="center"/>
                                     <w:rPr>
                                       <w:rFonts w:ascii="Times New Roman"/>
                                       <w:sz w:val="18"/>
                                     </w:rPr>
                                   </w:pPr>
-                                  <w:r>
-                                    <w:rPr>
-                                      <w:b/>
-                                      <w:sz w:val="16"/>
-                                    </w:rPr>
-                                    <w:t>${</w:t>
-                                  </w:r>
-                                  <w:r>
-                                    <w:rPr>
-                                      <w:b/>
-                                      <w:sz w:val="16"/>
-                                    </w:rPr>
-                                    <w:t>late</w:t>
-                                  </w:r>
-                                  <w:r>
-                                    <w:rPr>
-                                      <w:b/>
-                                      <w:sz w:val="16"/>
-                                    </w:rPr>
-                                    <w:t>2</w:t>
-                                  </w:r>
                                   <w:bookmarkStart w:id="0" w:name="_GoBack"/>
                                   <w:bookmarkEnd w:id="0"/>
-                                  <w:r>
-                                    <w:rPr>
-                                      <w:b/>
-                                      <w:sz w:val="16"/>
-                                    </w:rPr>
-                                    <w:t>}</w:t>
-                                  </w:r>
                                 </w:p>
                               </w:tc>
                               <w:tc>
@@ -1989,34 +1886,6 @@
                                       <w:sz w:val="18"/>
                                     </w:rPr>
                                   </w:pPr>
-                                  <w:r>
-                                    <w:rPr>
-                                      <w:b/>
-                                      <w:sz w:val="16"/>
-                                    </w:rPr>
-                                    <w:t>${</w:t>
-                                  </w:r>
-                                  <w:r>
-                                    <w:rPr>
-                                      <w:b/>
-                                      <w:sz w:val="16"/>
-                                    </w:rPr>
-                                    <w:t>ut</w:t>
-                                  </w:r>
-                                  <w:r>
-                                    <w:rPr>
-                                      <w:b/>
-                                      <w:sz w:val="16"/>
-                                    </w:rPr>
-                                    <w:t>2</w:t>
-                                  </w:r>
-                                  <w:r>
-                                    <w:rPr>
-                                      <w:b/>
-                                      <w:sz w:val="16"/>
-                                    </w:rPr>
-                                    <w:t>}</w:t>
-                                  </w:r>
                                 </w:p>
                               </w:tc>
                             </w:tr>
@@ -2519,42 +2388,13 @@
                           <w:p>
                             <w:pPr>
                               <w:pStyle w:val="TableParagraph"/>
-                              <w:jc w:val="center"/>
                               <w:rPr>
                                 <w:rFonts w:ascii="Times New Roman"/>
                                 <w:sz w:val="18"/>
                               </w:rPr>
                             </w:pPr>
-                            <w:r>
-                              <w:rPr>
-                                <w:b/>
-                                <w:sz w:val="16"/>
-                              </w:rPr>
-                              <w:t>${</w:t>
-                            </w:r>
-                            <w:r>
-                              <w:rPr>
-                                <w:b/>
-                                <w:sz w:val="16"/>
-                              </w:rPr>
-                              <w:t>late</w:t>
-                            </w:r>
-                            <w:r>
-                              <w:rPr>
-                                <w:b/>
-                                <w:sz w:val="16"/>
-                              </w:rPr>
-                              <w:t>2</w:t>
-                            </w:r>
                             <w:bookmarkStart w:id="1" w:name="_GoBack"/>
                             <w:bookmarkEnd w:id="1"/>
-                            <w:r>
-                              <w:rPr>
-                                <w:b/>
-                                <w:sz w:val="16"/>
-                              </w:rPr>
-                              <w:t>}</w:t>
-                            </w:r>
                           </w:p>
                         </w:tc>
                         <w:tc>
@@ -2570,34 +2410,6 @@
                                 <w:sz w:val="18"/>
                               </w:rPr>
                             </w:pPr>
-                            <w:r>
-                              <w:rPr>
-                                <w:b/>
-                                <w:sz w:val="16"/>
-                              </w:rPr>
-                              <w:t>${</w:t>
-                            </w:r>
-                            <w:r>
-                              <w:rPr>
-                                <w:b/>
-                                <w:sz w:val="16"/>
-                              </w:rPr>
-                              <w:t>ut</w:t>
-                            </w:r>
-                            <w:r>
-                              <w:rPr>
-                                <w:b/>
-                                <w:sz w:val="16"/>
-                              </w:rPr>
-                              <w:t>2</w:t>
-                            </w:r>
-                            <w:r>
-                              <w:rPr>
-                                <w:b/>
-                                <w:sz w:val="16"/>
-                              </w:rPr>
-                              <w:t>}</w:t>
-                            </w:r>
                           </w:p>
                         </w:tc>
                       </w:tr>

</xml_diff>

<commit_message>
backend late and undertime calculation
</commit_message>
<xml_diff>
--- a/storage/app/templates/Sample.docx
+++ b/storage/app/templates/Sample.docx
@@ -728,6 +728,7 @@
                                       <w:sz w:val="16"/>
                                     </w:rPr>
                                   </w:pPr>
+                                  <w:bookmarkStart w:id="0" w:name="_GoBack" w:colFirst="1" w:colLast="7"/>
                                   <w:r>
                                     <w:rPr>
                                       <w:b/>
@@ -853,12 +854,29 @@
                                 </w:tcPr>
                                 <w:p>
                                   <w:pPr>
-                                    <w:pStyle w:val="TableParagraph"/>
-                                    <w:rPr>
-                                      <w:rFonts w:ascii="Times New Roman"/>
-                                      <w:sz w:val="18"/>
-                                    </w:rPr>
+                                    <w:jc w:val="center"/>
                                   </w:pPr>
+                                  <w:r>
+                                    <w:rPr>
+                                      <w:b/>
+                                      <w:sz w:val="16"/>
+                                    </w:rPr>
+                                    <w:t>${</w:t>
+                                  </w:r>
+                                  <w:r>
+                                    <w:rPr>
+                                      <w:b/>
+                                      <w:sz w:val="16"/>
+                                    </w:rPr>
+                                    <w:t>late</w:t>
+                                  </w:r>
+                                  <w:r>
+                                    <w:rPr>
+                                      <w:b/>
+                                      <w:sz w:val="16"/>
+                                    </w:rPr>
+                                    <w:t>1}</w:t>
+                                  </w:r>
                                 </w:p>
                               </w:tc>
                               <w:tc>
@@ -867,15 +885,40 @@
                                 </w:tcPr>
                                 <w:p>
                                   <w:pPr>
-                                    <w:pStyle w:val="TableParagraph"/>
-                                    <w:rPr>
-                                      <w:rFonts w:ascii="Times New Roman"/>
-                                      <w:sz w:val="18"/>
-                                    </w:rPr>
+                                    <w:jc w:val="center"/>
                                   </w:pPr>
+                                  <w:r>
+                                    <w:rPr>
+                                      <w:b/>
+                                      <w:sz w:val="16"/>
+                                    </w:rPr>
+                                    <w:t>${</w:t>
+                                  </w:r>
+                                  <w:r>
+                                    <w:rPr>
+                                      <w:b/>
+                                      <w:sz w:val="16"/>
+                                    </w:rPr>
+                                    <w:t>under</w:t>
+                                  </w:r>
+                                  <w:r>
+                                    <w:rPr>
+                                      <w:b/>
+                                      <w:sz w:val="16"/>
+                                    </w:rPr>
+                                    <w:t>1</w:t>
+                                  </w:r>
+                                  <w:r>
+                                    <w:rPr>
+                                      <w:b/>
+                                      <w:sz w:val="16"/>
+                                    </w:rPr>
+                                    <w:t>}</w:t>
+                                  </w:r>
                                 </w:p>
                               </w:tc>
                             </w:tr>
+                            <w:bookmarkEnd w:id="0"/>
                           </w:tbl>
                           <w:p>
                             <w:pPr>
@@ -1185,6 +1228,7 @@
                                 <w:sz w:val="16"/>
                               </w:rPr>
                             </w:pPr>
+                            <w:bookmarkStart w:id="1" w:name="_GoBack" w:colFirst="1" w:colLast="7"/>
                             <w:r>
                               <w:rPr>
                                 <w:b/>
@@ -1310,12 +1354,29 @@
                           </w:tcPr>
                           <w:p>
                             <w:pPr>
-                              <w:pStyle w:val="TableParagraph"/>
-                              <w:rPr>
-                                <w:rFonts w:ascii="Times New Roman"/>
-                                <w:sz w:val="18"/>
-                              </w:rPr>
+                              <w:jc w:val="center"/>
                             </w:pPr>
+                            <w:r>
+                              <w:rPr>
+                                <w:b/>
+                                <w:sz w:val="16"/>
+                              </w:rPr>
+                              <w:t>${</w:t>
+                            </w:r>
+                            <w:r>
+                              <w:rPr>
+                                <w:b/>
+                                <w:sz w:val="16"/>
+                              </w:rPr>
+                              <w:t>late</w:t>
+                            </w:r>
+                            <w:r>
+                              <w:rPr>
+                                <w:b/>
+                                <w:sz w:val="16"/>
+                              </w:rPr>
+                              <w:t>1}</w:t>
+                            </w:r>
                           </w:p>
                         </w:tc>
                         <w:tc>
@@ -1324,15 +1385,40 @@
                           </w:tcPr>
                           <w:p>
                             <w:pPr>
-                              <w:pStyle w:val="TableParagraph"/>
-                              <w:rPr>
-                                <w:rFonts w:ascii="Times New Roman"/>
-                                <w:sz w:val="18"/>
-                              </w:rPr>
+                              <w:jc w:val="center"/>
                             </w:pPr>
+                            <w:r>
+                              <w:rPr>
+                                <w:b/>
+                                <w:sz w:val="16"/>
+                              </w:rPr>
+                              <w:t>${</w:t>
+                            </w:r>
+                            <w:r>
+                              <w:rPr>
+                                <w:b/>
+                                <w:sz w:val="16"/>
+                              </w:rPr>
+                              <w:t>under</w:t>
+                            </w:r>
+                            <w:r>
+                              <w:rPr>
+                                <w:b/>
+                                <w:sz w:val="16"/>
+                              </w:rPr>
+                              <w:t>1</w:t>
+                            </w:r>
+                            <w:r>
+                              <w:rPr>
+                                <w:b/>
+                                <w:sz w:val="16"/>
+                              </w:rPr>
+                              <w:t>}</w:t>
+                            </w:r>
                           </w:p>
                         </w:tc>
                       </w:tr>
+                      <w:bookmarkEnd w:id="1"/>
                     </w:tbl>
                     <w:p>
                       <w:pPr>
@@ -1695,21 +1781,7 @@
                                       <w:b/>
                                       <w:sz w:val="16"/>
                                     </w:rPr>
-                                    <w:t>${d</w:t>
-                                  </w:r>
-                                  <w:r>
-                                    <w:rPr>
-                                      <w:b/>
-                                      <w:sz w:val="16"/>
-                                    </w:rPr>
-                                    <w:t>2</w:t>
-                                  </w:r>
-                                  <w:r>
-                                    <w:rPr>
-                                      <w:b/>
-                                      <w:sz w:val="16"/>
-                                    </w:rPr>
-                                    <w:t>}</w:t>
+                                    <w:t>${d2}</w:t>
                                   </w:r>
                                 </w:p>
                               </w:tc>
@@ -1731,21 +1803,7 @@
                                       <w:b/>
                                       <w:sz w:val="16"/>
                                     </w:rPr>
-                                    <w:t>${in</w:t>
-                                  </w:r>
-                                  <w:r>
-                                    <w:rPr>
-                                      <w:b/>
-                                      <w:sz w:val="16"/>
-                                    </w:rPr>
-                                    <w:t>2</w:t>
-                                  </w:r>
-                                  <w:r>
-                                    <w:rPr>
-                                      <w:b/>
-                                      <w:sz w:val="16"/>
-                                    </w:rPr>
-                                    <w:t>}</w:t>
+                                    <w:t>${in2}</w:t>
                                   </w:r>
                                 </w:p>
                               </w:tc>
@@ -1767,21 +1825,7 @@
                                       <w:b/>
                                       <w:sz w:val="16"/>
                                     </w:rPr>
-                                    <w:t>${bout</w:t>
-                                  </w:r>
-                                  <w:r>
-                                    <w:rPr>
-                                      <w:b/>
-                                      <w:sz w:val="16"/>
-                                    </w:rPr>
-                                    <w:t>2</w:t>
-                                  </w:r>
-                                  <w:r>
-                                    <w:rPr>
-                                      <w:b/>
-                                      <w:sz w:val="16"/>
-                                    </w:rPr>
-                                    <w:t>}</w:t>
+                                    <w:t>${bout2}</w:t>
                                   </w:r>
                                 </w:p>
                               </w:tc>
@@ -1803,21 +1847,7 @@
                                       <w:b/>
                                       <w:sz w:val="16"/>
                                     </w:rPr>
-                                    <w:t>${bin</w:t>
-                                  </w:r>
-                                  <w:r>
-                                    <w:rPr>
-                                      <w:b/>
-                                      <w:sz w:val="16"/>
-                                    </w:rPr>
-                                    <w:t>2</w:t>
-                                  </w:r>
-                                  <w:r>
-                                    <w:rPr>
-                                      <w:b/>
-                                      <w:sz w:val="16"/>
-                                    </w:rPr>
-                                    <w:t>}</w:t>
+                                    <w:t>${bin2}</w:t>
                                   </w:r>
                                 </w:p>
                               </w:tc>
@@ -1839,21 +1869,7 @@
                                       <w:b/>
                                       <w:sz w:val="16"/>
                                     </w:rPr>
-                                    <w:t>${out</w:t>
-                                  </w:r>
-                                  <w:r>
-                                    <w:rPr>
-                                      <w:b/>
-                                      <w:sz w:val="16"/>
-                                    </w:rPr>
-                                    <w:t>2</w:t>
-                                  </w:r>
-                                  <w:r>
-                                    <w:rPr>
-                                      <w:b/>
-                                      <w:sz w:val="16"/>
-                                    </w:rPr>
-                                    <w:t>}</w:t>
+                                    <w:t>${out2}</w:t>
                                   </w:r>
                                 </w:p>
                               </w:tc>
@@ -1864,13 +1880,36 @@
                                 <w:p>
                                   <w:pPr>
                                     <w:pStyle w:val="TableParagraph"/>
-                                    <w:rPr>
-                                      <w:rFonts w:ascii="Times New Roman"/>
+                                    <w:jc w:val="center"/>
+                                    <w:rPr>
+                                      <w:rFonts w:ascii="Arial" w:hAnsi="Arial" w:cs="Arial"/>
                                       <w:sz w:val="18"/>
                                     </w:rPr>
                                   </w:pPr>
-                                  <w:bookmarkStart w:id="0" w:name="_GoBack"/>
-                                  <w:bookmarkEnd w:id="0"/>
+                                  <w:r>
+                                    <w:rPr>
+                                      <w:rFonts w:ascii="Arial" w:hAnsi="Arial" w:cs="Arial"/>
+                                      <w:b/>
+                                      <w:sz w:val="16"/>
+                                    </w:rPr>
+                                    <w:t>${late</w:t>
+                                  </w:r>
+                                  <w:r>
+                                    <w:rPr>
+                                      <w:rFonts w:ascii="Arial" w:hAnsi="Arial" w:cs="Arial"/>
+                                      <w:b/>
+                                      <w:sz w:val="16"/>
+                                    </w:rPr>
+                                    <w:t>2</w:t>
+                                  </w:r>
+                                  <w:r>
+                                    <w:rPr>
+                                      <w:rFonts w:ascii="Arial" w:hAnsi="Arial" w:cs="Arial"/>
+                                      <w:b/>
+                                      <w:sz w:val="16"/>
+                                    </w:rPr>
+                                    <w:t>}</w:t>
+                                  </w:r>
                                 </w:p>
                               </w:tc>
                               <w:tc>
@@ -1882,10 +1921,42 @@
                                     <w:pStyle w:val="TableParagraph"/>
                                     <w:jc w:val="center"/>
                                     <w:rPr>
-                                      <w:rFonts w:ascii="Times New Roman"/>
+                                      <w:rFonts w:ascii="Arial" w:hAnsi="Arial" w:cs="Arial"/>
                                       <w:sz w:val="18"/>
                                     </w:rPr>
                                   </w:pPr>
+                                  <w:r>
+                                    <w:rPr>
+                                      <w:rFonts w:ascii="Arial" w:hAnsi="Arial" w:cs="Arial"/>
+                                      <w:b/>
+                                      <w:sz w:val="16"/>
+                                    </w:rPr>
+                                    <w:t>$</w:t>
+                                  </w:r>
+                                  <w:r>
+                                    <w:rPr>
+                                      <w:rFonts w:ascii="Arial" w:hAnsi="Arial" w:cs="Arial"/>
+                                      <w:b/>
+                                      <w:sz w:val="16"/>
+                                    </w:rPr>
+                                    <w:t>{under</w:t>
+                                  </w:r>
+                                  <w:r>
+                                    <w:rPr>
+                                      <w:rFonts w:ascii="Arial" w:hAnsi="Arial" w:cs="Arial"/>
+                                      <w:b/>
+                                      <w:sz w:val="16"/>
+                                    </w:rPr>
+                                    <w:t>2</w:t>
+                                  </w:r>
+                                  <w:r>
+                                    <w:rPr>
+                                      <w:rFonts w:ascii="Arial" w:hAnsi="Arial" w:cs="Arial"/>
+                                      <w:b/>
+                                      <w:sz w:val="16"/>
+                                    </w:rPr>
+                                    <w:t>}</w:t>
+                                  </w:r>
                                 </w:p>
                               </w:tc>
                             </w:tr>
@@ -2219,21 +2290,7 @@
                                 <w:b/>
                                 <w:sz w:val="16"/>
                               </w:rPr>
-                              <w:t>${d</w:t>
-                            </w:r>
-                            <w:r>
-                              <w:rPr>
-                                <w:b/>
-                                <w:sz w:val="16"/>
-                              </w:rPr>
-                              <w:t>2</w:t>
-                            </w:r>
-                            <w:r>
-                              <w:rPr>
-                                <w:b/>
-                                <w:sz w:val="16"/>
-                              </w:rPr>
-                              <w:t>}</w:t>
+                              <w:t>${d2}</w:t>
                             </w:r>
                           </w:p>
                         </w:tc>
@@ -2255,21 +2312,7 @@
                                 <w:b/>
                                 <w:sz w:val="16"/>
                               </w:rPr>
-                              <w:t>${in</w:t>
-                            </w:r>
-                            <w:r>
-                              <w:rPr>
-                                <w:b/>
-                                <w:sz w:val="16"/>
-                              </w:rPr>
-                              <w:t>2</w:t>
-                            </w:r>
-                            <w:r>
-                              <w:rPr>
-                                <w:b/>
-                                <w:sz w:val="16"/>
-                              </w:rPr>
-                              <w:t>}</w:t>
+                              <w:t>${in2}</w:t>
                             </w:r>
                           </w:p>
                         </w:tc>
@@ -2291,21 +2334,7 @@
                                 <w:b/>
                                 <w:sz w:val="16"/>
                               </w:rPr>
-                              <w:t>${bout</w:t>
-                            </w:r>
-                            <w:r>
-                              <w:rPr>
-                                <w:b/>
-                                <w:sz w:val="16"/>
-                              </w:rPr>
-                              <w:t>2</w:t>
-                            </w:r>
-                            <w:r>
-                              <w:rPr>
-                                <w:b/>
-                                <w:sz w:val="16"/>
-                              </w:rPr>
-                              <w:t>}</w:t>
+                              <w:t>${bout2}</w:t>
                             </w:r>
                           </w:p>
                         </w:tc>
@@ -2327,21 +2356,7 @@
                                 <w:b/>
                                 <w:sz w:val="16"/>
                               </w:rPr>
-                              <w:t>${bin</w:t>
-                            </w:r>
-                            <w:r>
-                              <w:rPr>
-                                <w:b/>
-                                <w:sz w:val="16"/>
-                              </w:rPr>
-                              <w:t>2</w:t>
-                            </w:r>
-                            <w:r>
-                              <w:rPr>
-                                <w:b/>
-                                <w:sz w:val="16"/>
-                              </w:rPr>
-                              <w:t>}</w:t>
+                              <w:t>${bin2}</w:t>
                             </w:r>
                           </w:p>
                         </w:tc>
@@ -2363,21 +2378,7 @@
                                 <w:b/>
                                 <w:sz w:val="16"/>
                               </w:rPr>
-                              <w:t>${out</w:t>
-                            </w:r>
-                            <w:r>
-                              <w:rPr>
-                                <w:b/>
-                                <w:sz w:val="16"/>
-                              </w:rPr>
-                              <w:t>2</w:t>
-                            </w:r>
-                            <w:r>
-                              <w:rPr>
-                                <w:b/>
-                                <w:sz w:val="16"/>
-                              </w:rPr>
-                              <w:t>}</w:t>
+                              <w:t>${out2}</w:t>
                             </w:r>
                           </w:p>
                         </w:tc>
@@ -2388,13 +2389,36 @@
                           <w:p>
                             <w:pPr>
                               <w:pStyle w:val="TableParagraph"/>
-                              <w:rPr>
-                                <w:rFonts w:ascii="Times New Roman"/>
+                              <w:jc w:val="center"/>
+                              <w:rPr>
+                                <w:rFonts w:ascii="Arial" w:hAnsi="Arial" w:cs="Arial"/>
                                 <w:sz w:val="18"/>
                               </w:rPr>
                             </w:pPr>
-                            <w:bookmarkStart w:id="1" w:name="_GoBack"/>
-                            <w:bookmarkEnd w:id="1"/>
+                            <w:r>
+                              <w:rPr>
+                                <w:rFonts w:ascii="Arial" w:hAnsi="Arial" w:cs="Arial"/>
+                                <w:b/>
+                                <w:sz w:val="16"/>
+                              </w:rPr>
+                              <w:t>${late</w:t>
+                            </w:r>
+                            <w:r>
+                              <w:rPr>
+                                <w:rFonts w:ascii="Arial" w:hAnsi="Arial" w:cs="Arial"/>
+                                <w:b/>
+                                <w:sz w:val="16"/>
+                              </w:rPr>
+                              <w:t>2</w:t>
+                            </w:r>
+                            <w:r>
+                              <w:rPr>
+                                <w:rFonts w:ascii="Arial" w:hAnsi="Arial" w:cs="Arial"/>
+                                <w:b/>
+                                <w:sz w:val="16"/>
+                              </w:rPr>
+                              <w:t>}</w:t>
+                            </w:r>
                           </w:p>
                         </w:tc>
                         <w:tc>
@@ -2406,10 +2430,42 @@
                               <w:pStyle w:val="TableParagraph"/>
                               <w:jc w:val="center"/>
                               <w:rPr>
-                                <w:rFonts w:ascii="Times New Roman"/>
+                                <w:rFonts w:ascii="Arial" w:hAnsi="Arial" w:cs="Arial"/>
                                 <w:sz w:val="18"/>
                               </w:rPr>
                             </w:pPr>
+                            <w:r>
+                              <w:rPr>
+                                <w:rFonts w:ascii="Arial" w:hAnsi="Arial" w:cs="Arial"/>
+                                <w:b/>
+                                <w:sz w:val="16"/>
+                              </w:rPr>
+                              <w:t>$</w:t>
+                            </w:r>
+                            <w:r>
+                              <w:rPr>
+                                <w:rFonts w:ascii="Arial" w:hAnsi="Arial" w:cs="Arial"/>
+                                <w:b/>
+                                <w:sz w:val="16"/>
+                              </w:rPr>
+                              <w:t>{under</w:t>
+                            </w:r>
+                            <w:r>
+                              <w:rPr>
+                                <w:rFonts w:ascii="Arial" w:hAnsi="Arial" w:cs="Arial"/>
+                                <w:b/>
+                                <w:sz w:val="16"/>
+                              </w:rPr>
+                              <w:t>2</w:t>
+                            </w:r>
+                            <w:r>
+                              <w:rPr>
+                                <w:rFonts w:ascii="Arial" w:hAnsi="Arial" w:cs="Arial"/>
+                                <w:b/>
+                                <w:sz w:val="16"/>
+                              </w:rPr>
+                              <w:t>}</w:t>
+                            </w:r>
                           </w:p>
                         </w:tc>
                       </w:tr>

</xml_diff>